<commit_message>
fix(export): make Markdown->DOCX output schema-valid so Word can open it
The generated .docx files failed to open in Word due to two OOXML
schema violations produced by export_markdown_to_docx.py:

- <w:pBdr> (heading bottom border) was appended at the end of <w:pPr>,
  violating the required CT_PPr child order. Insert it before
  spacing/ind/jc/rPr instead.
- python-docx's default <w:zoom> lacked the schema-required w:percent
  attribute. Set w:percent="100".

Regenerate the Google Forms Social Lead Sequence activation (92) and
troubleshooting (94) guides; both now pass OOXML schema validation.

Co-Authored-By: Claude Opus 4.8 <noreply@anthropic.com>
</commit_message>
<xml_diff>
--- a/docs/transferai-admin/word/92_Guide_Activation_Google_Forms_Social_Lead_Sequence_V1.docx
+++ b/docs/transferai-admin/word/92_Guide_Activation_Google_Forms_Social_Lead_Sequence_V1.docx
@@ -5,11 +5,11 @@
     <w:p>
       <w:pPr>
         <w:pStyle w:val="Title"/>
-        <w:spacing w:after="200"/>
-        <w:jc w:val="center"/>
         <w:pBdr>
           <w:bottom w:val="single" w:sz="8" w:space="1" w:color="D9E2F2"/>
         </w:pBdr>
+        <w:spacing w:after="200"/>
+        <w:jc w:val="center"/>
       </w:pPr>
       <w:r>
         <w:t>Guide d’activation - Google Forms Social Lead Sequence V1</w:t>

</xml_diff>